<commit_message>
Update PRD Word document to include Cost and Development Benchmark analysis
</commit_message>
<xml_diff>
--- a/Chronologie_Manual_Book_V2_PRD.docx
+++ b/Chronologie_Manual_Book_V2_PRD.docx
@@ -685,6 +685,331 @@
         <w:t>Framer Motion for iOS-like transitions and button physics.</w:t>
       </w:r>
     </w:p>
+    <w:p>
+      <w:pPr>
+        <w:pStyle w:val="Heading1"/>
+        <w:spacing w:before="360" w:after="120"/>
+      </w:pPr>
+      <w:r>
+        <w:rPr>
+          <w:rFonts w:ascii="Outfit" w:hAnsi="Outfit"/>
+          <w:b/>
+          <w:color w:val="442A07"/>
+          <w:sz w:val="32"/>
+        </w:rPr>
+        <w:t>5. Cost &amp; Development Benchmark (Outsource vs. Self Dev + AI)</w:t>
+      </w:r>
+    </w:p>
+    <w:p>
+      <w:pPr>
+        <w:spacing w:line="276" w:lineRule="auto" w:after="200"/>
+      </w:pPr>
+      <w:r>
+        <w:t>Analisis perbandingan biaya dan efisiensi pengembangan sistem manual book antara menggunakan jasa pihak ketiga (Agency/Freelancer) dengan pengembangan mandiri dibantu AI (Self Development + Claude Pro &amp; Vercel Hosting):</w:t>
+      </w:r>
+    </w:p>
+    <w:tbl>
+      <w:tblPr>
+        <w:tblW w:type="auto" w:w="0"/>
+        <w:jc w:val="center"/>
+        <w:tblLook w:firstColumn="1" w:firstRow="1" w:lastColumn="0" w:lastRow="0" w:noHBand="0" w:noVBand="1" w:val="04A0"/>
+      </w:tblPr>
+      <w:tblGrid>
+        <w:gridCol w:w="3120"/>
+        <w:gridCol w:w="3120"/>
+        <w:gridCol w:w="3120"/>
+      </w:tblGrid>
+      <w:tr>
+        <w:tc>
+          <w:tcPr>
+            <w:tcW w:type="dxa" w:w="3120"/>
+            <w:shd w:fill="442A07"/>
+          </w:tcPr>
+          <w:p>
+            <w:r>
+              <w:rPr>
+                <w:b/>
+                <w:color w:val="FFFFFF"/>
+              </w:rPr>
+              <w:t>Komponen Biaya</w:t>
+            </w:r>
+          </w:p>
+        </w:tc>
+        <w:tc>
+          <w:tcPr>
+            <w:tcW w:type="dxa" w:w="3120"/>
+            <w:shd w:fill="442A07"/>
+          </w:tcPr>
+          <w:p>
+            <w:r>
+              <w:rPr>
+                <w:b/>
+                <w:color w:val="FFFFFF"/>
+              </w:rPr>
+              <w:t>Jasa Outsource (Freelance/Agency)</w:t>
+            </w:r>
+          </w:p>
+        </w:tc>
+        <w:tc>
+          <w:tcPr>
+            <w:tcW w:type="dxa" w:w="3120"/>
+            <w:shd w:fill="442A07"/>
+          </w:tcPr>
+          <w:p>
+            <w:r>
+              <w:rPr>
+                <w:b/>
+                <w:color w:val="FFFFFF"/>
+              </w:rPr>
+              <w:t>Self Dev + AI (Claude + Vercel)</w:t>
+            </w:r>
+          </w:p>
+        </w:tc>
+      </w:tr>
+      <w:tr>
+        <w:tc>
+          <w:tcPr>
+            <w:tcW w:type="dxa" w:w="3120"/>
+            <w:shd w:fill="FBF9F1"/>
+          </w:tcPr>
+          <w:p>
+            <w:r>
+              <w:t>Biaya Pembuatan Awal (Dev)</w:t>
+            </w:r>
+          </w:p>
+        </w:tc>
+        <w:tc>
+          <w:tcPr>
+            <w:tcW w:type="dxa" w:w="3120"/>
+            <w:shd w:fill="FBF9F1"/>
+          </w:tcPr>
+          <w:p>
+            <w:r>
+              <w:t>Rp 5.000.000 - Rp 15.000.000</w:t>
+              <w:br/>
+              <w:t>(Biaya jasa pembuatan aplikasi SPA)</w:t>
+            </w:r>
+          </w:p>
+        </w:tc>
+        <w:tc>
+          <w:tcPr>
+            <w:tcW w:type="dxa" w:w="3120"/>
+            <w:shd w:fill="FBF9F1"/>
+          </w:tcPr>
+          <w:p>
+            <w:r>
+              <w:t>Rp 0</w:t>
+              <w:br/>
+              <w:t>(Dikerjakan mandiri dibantu AI)</w:t>
+            </w:r>
+          </w:p>
+        </w:tc>
+      </w:tr>
+      <w:tr>
+        <w:tc>
+          <w:tcPr>
+            <w:tcW w:type="dxa" w:w="3120"/>
+            <w:shd w:fill="FFFFFF"/>
+          </w:tcPr>
+          <w:p>
+            <w:r>
+              <w:t>Alat Bantu AI (Claude/Gemini)</w:t>
+            </w:r>
+          </w:p>
+        </w:tc>
+        <w:tc>
+          <w:tcPr>
+            <w:tcW w:type="dxa" w:w="3120"/>
+            <w:shd w:fill="FFFFFF"/>
+          </w:tcPr>
+          <w:p>
+            <w:r>
+              <w:t>Rp 0</w:t>
+            </w:r>
+          </w:p>
+        </w:tc>
+        <w:tc>
+          <w:tcPr>
+            <w:tcW w:type="dxa" w:w="3120"/>
+            <w:shd w:fill="FFFFFF"/>
+          </w:tcPr>
+          <w:p>
+            <w:r>
+              <w:t>Rp 325.000 / bulan ($20)</w:t>
+              <w:br/>
+              <w:t>Total Setahun: Rp 3.900.000</w:t>
+            </w:r>
+          </w:p>
+        </w:tc>
+      </w:tr>
+      <w:tr>
+        <w:tc>
+          <w:tcPr>
+            <w:tcW w:type="dxa" w:w="3120"/>
+            <w:shd w:fill="FBF9F1"/>
+          </w:tcPr>
+          <w:p>
+            <w:r>
+              <w:t>Biaya Hosting &amp; Server</w:t>
+            </w:r>
+          </w:p>
+        </w:tc>
+        <w:tc>
+          <w:tcPr>
+            <w:tcW w:type="dxa" w:w="3120"/>
+            <w:shd w:fill="FBF9F1"/>
+          </w:tcPr>
+          <w:p>
+            <w:r>
+              <w:t>Rp 200.000 - Rp 500.000 / bulan</w:t>
+              <w:br/>
+              <w:t>Total Setahun: Rp 2.400.000 - Rp 6.000.000</w:t>
+            </w:r>
+          </w:p>
+        </w:tc>
+        <w:tc>
+          <w:tcPr>
+            <w:tcW w:type="dxa" w:w="3120"/>
+            <w:shd w:fill="FBF9F1"/>
+          </w:tcPr>
+          <w:p>
+            <w:r>
+              <w:t>Rp 0 (Vercel Hobby Tier - Free)</w:t>
+              <w:br/>
+              <w:t>Total Setahun: Rp 0</w:t>
+            </w:r>
+          </w:p>
+        </w:tc>
+      </w:tr>
+      <w:tr>
+        <w:tc>
+          <w:tcPr>
+            <w:tcW w:type="dxa" w:w="3120"/>
+            <w:shd w:fill="FFFFFF"/>
+          </w:tcPr>
+          <w:p>
+            <w:r>
+              <w:t>Kustom Domain (.id)</w:t>
+            </w:r>
+          </w:p>
+        </w:tc>
+        <w:tc>
+          <w:tcPr>
+            <w:tcW w:type="dxa" w:w="3120"/>
+            <w:shd w:fill="FFFFFF"/>
+          </w:tcPr>
+          <w:p>
+            <w:r>
+              <w:t>Rp 150.000 - Rp 250.000 / tahun</w:t>
+            </w:r>
+          </w:p>
+        </w:tc>
+        <w:tc>
+          <w:tcPr>
+            <w:tcW w:type="dxa" w:w="3120"/>
+            <w:shd w:fill="FFFFFF"/>
+          </w:tcPr>
+          <w:p>
+            <w:r>
+              <w:t>Rp 150.000 - Rp 250.000 / tahun</w:t>
+            </w:r>
+          </w:p>
+        </w:tc>
+      </w:tr>
+      <w:tr>
+        <w:tc>
+          <w:tcPr>
+            <w:tcW w:type="dxa" w:w="3120"/>
+            <w:shd w:fill="FBF9F1"/>
+          </w:tcPr>
+          <w:p>
+            <w:r>
+              <w:t>Pemeliharaan &amp; Update Konten</w:t>
+            </w:r>
+          </w:p>
+        </w:tc>
+        <w:tc>
+          <w:tcPr>
+            <w:tcW w:type="dxa" w:w="3120"/>
+            <w:shd w:fill="FBF9F1"/>
+          </w:tcPr>
+          <w:p>
+            <w:r>
+              <w:t>Rp 500.000 - Rp 1.500.000 / update</w:t>
+              <w:br/>
+              <w:t>(Setiap ada revisi / tambah file PDF baru)</w:t>
+            </w:r>
+          </w:p>
+        </w:tc>
+        <w:tc>
+          <w:tcPr>
+            <w:tcW w:type="dxa" w:w="3120"/>
+            <w:shd w:fill="FBF9F1"/>
+          </w:tcPr>
+          <w:p>
+            <w:r>
+              <w:t>Rp 0 (Mandiri secara instan lewat AI)</w:t>
+              <w:br/>
+              <w:t>Tanpa batasan revisi</w:t>
+            </w:r>
+          </w:p>
+        </w:tc>
+      </w:tr>
+    </w:tbl>
+    <w:p>
+      <w:pPr>
+        <w:spacing w:before="240" w:line="276" w:lineRule="auto"/>
+      </w:pPr>
+      <w:r>
+        <w:rPr>
+          <w:b/>
+          <w:color w:val="442A07"/>
+        </w:rPr>
+        <w:br/>
+        <w:t>Total Estimasi Biaya Tahun Pertama:</w:t>
+        <w:br/>
+      </w:r>
+      <w:r>
+        <w:t xml:space="preserve">• Jasa Outsource: </w:t>
+      </w:r>
+      <w:r>
+        <w:rPr>
+          <w:b/>
+        </w:rPr>
+        <w:t>Rp 7.550.000 - Rp 21.250.000</w:t>
+        <w:br/>
+      </w:r>
+      <w:r>
+        <w:t xml:space="preserve">• Self Dev + AI: </w:t>
+      </w:r>
+      <w:r>
+        <w:rPr>
+          <w:b/>
+        </w:rPr>
+        <w:t>Rp 4.050.000 - Rp 4.150.000</w:t>
+        <w:br/>
+      </w:r>
+      <w:r>
+        <w:rPr>
+          <w:b/>
+          <w:color w:val="8F6F3F"/>
+        </w:rPr>
+        <w:br/>
+        <w:t xml:space="preserve">Kesimpulan &amp; Efisiensi: </w:t>
+      </w:r>
+      <w:r>
+        <w:t xml:space="preserve">Self-Development dengan bantuan Claude Pro menghemat biaya hingga </w:t>
+      </w:r>
+      <w:r>
+        <w:rPr>
+          <w:b/>
+        </w:rPr>
+        <w:t xml:space="preserve">50% - 80% </w:t>
+      </w:r>
+      <w:r>
+        <w:t>pada tahun pertama. Ditambah lagi, proses penambahan file PDF manual di masa depan dapat dilakukan secara mandiri hanya dalam beberapa menit tanpa ketergantungan atau biaya revisi dari pihak ketiga.</w:t>
+      </w:r>
+    </w:p>
     <w:sectPr>
       <w:pgSz w:w="12240" w:h="15840"/>
       <w:pgMar w:top="1440" w:right="1440" w:bottom="1440" w:left="1440" w:header="720" w:footer="720" w:gutter="0"/>

</xml_diff>

<commit_message>
Update PRD Word document to adopt a Business-IT Partner perspective with Issues, Objectives, and KPIs
</commit_message>
<xml_diff>
--- a/Chronologie_Manual_Book_V2_PRD.docx
+++ b/Chronologie_Manual_Book_V2_PRD.docx
@@ -4,7 +4,7 @@
   <w:body>
     <w:p>
       <w:pPr>
-        <w:spacing w:before="2000" w:after="200"/>
+        <w:spacing w:before="1600" w:after="200"/>
         <w:jc w:val="center"/>
       </w:pPr>
       <w:r>
@@ -12,15 +12,15 @@
           <w:rFonts w:ascii="Outfit" w:hAnsi="Outfit"/>
           <w:b/>
           <w:color w:val="442A07"/>
-          <w:sz w:val="48"/>
+          <w:sz w:val="40"/>
         </w:rPr>
-        <w:t>PRODUCT REQUIREMENT DOCUMENT</w:t>
+        <w:t>BUSINESS-IT PARTNERSHIP PRD</w:t>
         <w:br/>
       </w:r>
     </w:p>
     <w:p>
       <w:pPr>
-        <w:spacing w:after="4000"/>
+        <w:spacing w:after="3600"/>
         <w:jc w:val="center"/>
       </w:pPr>
       <w:r>
@@ -28,29 +28,15 @@
           <w:rFonts w:ascii="Outfit" w:hAnsi="Outfit"/>
           <w:i/>
           <w:color w:val="8F6F3F"/>
-          <w:sz w:val="32"/>
+          <w:sz w:val="28"/>
         </w:rPr>
-        <w:t>Chronologie Manual Book Platform (V2)</w:t>
+        <w:t>Chronologie Watch Manuals Digitalization (V2)</w:t>
       </w:r>
     </w:p>
     <w:p>
       <w:pPr>
-        <w:spacing w:before="1000" w:line="312" w:lineRule="auto"/>
+        <w:spacing w:line="312" w:lineRule="auto"/>
       </w:pPr>
-      <w:r>
-        <w:rPr>
-          <w:b/>
-          <w:color w:val="442A07"/>
-        </w:rPr>
-        <w:t xml:space="preserve">Project Name: </w:t>
-      </w:r>
-      <w:r>
-        <w:rPr>
-          <w:color w:val="2B2622"/>
-        </w:rPr>
-        <w:t>Chronologie Watch Manuals Landing Page &amp; Viewer (V2)</w:t>
-        <w:br/>
-      </w:r>
       <w:r>
         <w:rPr>
           <w:b/>
@@ -62,7 +48,21 @@
         <w:rPr>
           <w:color w:val="2B2622"/>
         </w:rPr>
-        <w:t>Mobile Web (Primary), Desktop Web (Responsive Shell)</w:t>
+        <w:t>Mobile Browser (Warranty QR Redirect) &amp; Desktop Web Preview</w:t>
+        <w:br/>
+      </w:r>
+      <w:r>
+        <w:rPr>
+          <w:b/>
+          <w:color w:val="442A07"/>
+        </w:rPr>
+        <w:t xml:space="preserve">Business Context: </w:t>
+      </w:r>
+      <w:r>
+        <w:rPr>
+          <w:color w:val="2B2622"/>
+        </w:rPr>
+        <w:t>Elevating Customer Experience (CX) through Digitalized Watch Manuals</w:t>
         <w:br/>
       </w:r>
       <w:r>
@@ -98,7 +98,7 @@
           <w:b/>
           <w:color w:val="442A07"/>
         </w:rPr>
-        <w:t xml:space="preserve">Repository: </w:t>
+        <w:t xml:space="preserve">Project Repository: </w:t>
       </w:r>
       <w:r>
         <w:rPr>
@@ -116,16 +116,16 @@
     <w:p>
       <w:pPr>
         <w:pStyle w:val="Heading1"/>
-        <w:spacing w:before="360" w:after="120"/>
+        <w:spacing w:before="320" w:after="120"/>
       </w:pPr>
       <w:r>
         <w:rPr>
           <w:rFonts w:ascii="Outfit" w:hAnsi="Outfit"/>
           <w:b/>
           <w:color w:val="442A07"/>
-          <w:sz w:val="32"/>
+          <w:sz w:val="30"/>
         </w:rPr>
-        <w:t>1. Product Overview &amp; Goals</w:t>
+        <w:t>1. Business Issues (Latar Belakang Masalah)</w:t>
       </w:r>
     </w:p>
     <w:p>
@@ -133,52 +133,7 @@
         <w:spacing w:after="120" w:line="276" w:lineRule="auto"/>
       </w:pPr>
       <w:r>
-        <w:t>Chronologie is a luxury watch retailer. When customers purchase a watch, they receive a box or warranty card containing a QR Code. The Chronologie Manual Book Platform (V2) is a premium, mobile-first Web Application designed to host and display watch user manuals. By scanning a QR code, customers are immediately taken to either:</w:t>
-      </w:r>
-    </w:p>
-    <w:p>
-      <w:pPr>
-        <w:pStyle w:val="ListBullet"/>
-      </w:pPr>
-      <w:r>
-        <w:rPr>
-          <w:b/>
-          <w:color w:val="442A07"/>
-        </w:rPr>
-        <w:t xml:space="preserve">View Mode (Online Reader): </w:t>
-      </w:r>
-      <w:r>
-        <w:t>An elegant, inside-browser PDF reader to view operating instructions immediately.</w:t>
-      </w:r>
-    </w:p>
-    <w:p>
-      <w:pPr>
-        <w:pStyle w:val="ListBullet"/>
-      </w:pPr>
-      <w:r>
-        <w:rPr>
-          <w:b/>
-          <w:color w:val="442A07"/>
-        </w:rPr>
-        <w:t xml:space="preserve">Download Mode (Offline Access): </w:t>
-      </w:r>
-      <w:r>
-        <w:t>A direct file trigger that downloads the manual directly onto their mobile storage.</w:t>
-      </w:r>
-    </w:p>
-    <w:p>
-      <w:pPr>
-        <w:pStyle w:val="Heading2"/>
-        <w:spacing w:before="240" w:after="80"/>
-      </w:pPr>
-      <w:r>
-        <w:rPr>
-          <w:rFonts w:ascii="Outfit" w:hAnsi="Outfit"/>
-          <w:b/>
-          <w:color w:val="8F6F3F"/>
-          <w:sz w:val="26"/>
-        </w:rPr>
-        <w:t>1.1 Core Objectives</w:t>
+        <w:t>Sebagai butik jam tangan mewah, Chronologie berdedikasi memberikan pengalaman pelanggan (Customer Experience/CX) premium di setiap aspek. Namun, saat ini terdapat beberapa celah bisnis penting dalam penyediaan buku panduan fisik dan digital:</w:t>
       </w:r>
     </w:p>
     <w:p>
@@ -189,10 +144,10 @@
         <w:rPr>
           <w:b/>
         </w:rPr>
-        <w:t xml:space="preserve">Elevate Brand Experience: </w:t>
+        <w:t xml:space="preserve">Pengalaman Pasca-Pembelian Kurang Premium: </w:t>
       </w:r>
       <w:r>
-        <w:t>Replace generic file-sharing views (like Google Drive) with a premium branded interface matching the aesthetic of the main Chronologie site.</w:t>
+        <w:t>Penyediaan panduan digital yang masih menggunakan folder mentah (Google Drive/Dropbox) merusak citra eksklusif butik Chronologie. Tampilan folder mentah membingungkan dan tidak ramah seluler (mobile-unfriendly).</w:t>
       </w:r>
     </w:p>
     <w:p>
@@ -203,10 +158,10 @@
         <w:rPr>
           <w:b/>
         </w:rPr>
-        <w:t xml:space="preserve">Streamline Discovery: </w:t>
+        <w:t xml:space="preserve">Pola Akses Kustomer yang Berbeda-beda: </w:t>
       </w:r>
       <w:r>
-        <w:t>Allow users to search, filter by brand, and read user guides in seconds on a mobile interface.</w:t>
+        <w:t>Sebagian kustomer lebih menyukai membaca langsung di browser HP secara instan (untuk menghemat memori), sementara sebagian lainnya ingin menyimpan dokumen PDF secara offline ke penyimpanan perangkat mereka.</w:t>
       </w:r>
     </w:p>
     <w:p>
@@ -217,48 +172,48 @@
         <w:rPr>
           <w:b/>
         </w:rPr>
-        <w:t xml:space="preserve">Dual QR-Code Flow: </w:t>
+        <w:t xml:space="preserve">Ketergantungan Operasional yang Tinggi &amp; Lambat: </w:t>
       </w:r>
       <w:r>
-        <w:t>Automate the generation of individual QR Codes for both online viewing and direct download modes for every watch manual.</w:t>
+        <w:t>Setiap kali butik menambah koleksi jam tangan baru, proses pengunggahan file dan pembaruan QR Code membutuhkan proses manual yang lama dari tim IT atau vendor luar, yang juga menambah biaya pemeliharaan jangka panjang.</w:t>
       </w:r>
     </w:p>
     <w:p>
       <w:pPr>
         <w:pStyle w:val="Heading1"/>
-        <w:spacing w:before="360" w:after="120"/>
+        <w:spacing w:before="320" w:after="120"/>
       </w:pPr>
       <w:r>
         <w:rPr>
           <w:rFonts w:ascii="Outfit" w:hAnsi="Outfit"/>
           <w:b/>
           <w:color w:val="442A07"/>
-          <w:sz w:val="32"/>
+          <w:sz w:val="30"/>
         </w:rPr>
-        <w:t>2. Functional Requirements</w:t>
+        <w:t>2. Project Objectives (Tujuan Strategis)</w:t>
+      </w:r>
+    </w:p>
+    <w:p>
+      <w:pPr>
+        <w:spacing w:after="120" w:line="276" w:lineRule="auto"/>
+      </w:pPr>
+      <w:r>
+        <w:t>Proyek digitalisasi ini menjembatani kebutuhan bisnis dengan kapabilitas IT untuk mencapai target berikut:</w:t>
       </w:r>
     </w:p>
     <w:p>
       <w:pPr>
         <w:pStyle w:val="Heading2"/>
-        <w:spacing w:before="240" w:after="80"/>
+        <w:spacing w:before="200" w:after="80"/>
       </w:pPr>
       <w:r>
         <w:rPr>
           <w:rFonts w:ascii="Outfit" w:hAnsi="Outfit"/>
           <w:b/>
           <w:color w:val="8F6F3F"/>
-          <w:sz w:val="26"/>
+          <w:sz w:val="24"/>
         </w:rPr>
-        <w:t>2.1 Landing Page (Home Portal)</w:t>
-      </w:r>
-    </w:p>
-    <w:p>
-      <w:pPr>
-        <w:spacing w:line="276" w:lineRule="auto"/>
-      </w:pPr>
-      <w:r>
-        <w:t>The Landing Page serves as the customer portal to browse manuals. Key aspects include:</w:t>
+        <w:t>2.1 Tujuan Bisnis (Business Objectives)</w:t>
       </w:r>
     </w:p>
     <w:p>
@@ -269,10 +224,10 @@
         <w:rPr>
           <w:b/>
         </w:rPr>
-        <w:t xml:space="preserve">Mobile-First Shell Frame: </w:t>
+        <w:t xml:space="preserve">Elevasi Brand Image: </w:t>
       </w:r>
       <w:r>
-        <w:t>On screens larger than 480px, the interface wraps into a centered, rounded smartphone shell (height 850px with soft shadows). On mobile devices, it scales to 100vh and covers the full screen.</w:t>
+        <w:t>Menghadirkan portal buku panduan bermerek khusus dengan desain visual mewah yang selaras dengan situs utama Chronologie.</w:t>
       </w:r>
     </w:p>
     <w:p>
@@ -283,10 +238,10 @@
         <w:rPr>
           <w:b/>
         </w:rPr>
-        <w:t xml:space="preserve">Sticky Navigation Bar: </w:t>
+        <w:t xml:space="preserve">Meningkatkan Kepuasan Pelanggan (CX): </w:t>
       </w:r>
       <w:r>
-        <w:t>Top header for 'CHRONOLOGIE Archive' and bottom iOS-style tab bar featuring 'Beranda', 'Pindai QR', and 'Bantuan'.</w:t>
+        <w:t>Menyediakan kemudahan satu-klik dari pemindaian QR Code di kotak jam langsung ke panduan digital yang dioptimalkan untuk HP kustomer.</w:t>
       </w:r>
     </w:p>
     <w:p>
@@ -297,10 +252,25 @@
         <w:rPr>
           <w:b/>
         </w:rPr>
-        <w:t xml:space="preserve">Instagram Story-Style Brand Selector: </w:t>
+        <w:t xml:space="preserve">Kemandirian Operasional: </w:t>
       </w:r>
       <w:r>
-        <w:t>Horizontal scrolling avatars showing watch brand initials (ALL, RW, ED, FC, HM, MN, YM).</w:t>
+        <w:t>Menghilangkan biaya dependensi vendor eksternal untuk pengelolaan katalog panduan jam tangan.</w:t>
+      </w:r>
+    </w:p>
+    <w:p>
+      <w:pPr>
+        <w:pStyle w:val="Heading2"/>
+        <w:spacing w:before="200" w:after="80"/>
+      </w:pPr>
+      <w:r>
+        <w:rPr>
+          <w:rFonts w:ascii="Outfit" w:hAnsi="Outfit"/>
+          <w:b/>
+          <w:color w:val="8F6F3F"/>
+          <w:sz w:val="24"/>
+        </w:rPr>
+        <w:t>2.2 Tujuan IT (IT Objectives)</w:t>
       </w:r>
     </w:p>
     <w:p>
@@ -311,322 +281,10 @@
         <w:rPr>
           <w:b/>
         </w:rPr>
-        <w:t xml:space="preserve">Clean Watch Model Title: </w:t>
+        <w:t xml:space="preserve">Aplikasi Ringan &amp; Serverless: </w:t>
       </w:r>
       <w:r>
-        <w:t>Titles are dynamically parsed to strip prefix codes (like '1002_ID') to maintain a professional design.</w:t>
-      </w:r>
-    </w:p>
-    <w:p>
-      <w:pPr>
-        <w:pStyle w:val="Heading2"/>
-        <w:spacing w:before="240" w:after="80"/>
-      </w:pPr>
-      <w:r>
-        <w:rPr>
-          <w:rFonts w:ascii="Outfit" w:hAnsi="Outfit"/>
-          <w:b/>
-          <w:color w:val="8F6F3F"/>
-          <w:sz w:val="26"/>
-        </w:rPr>
-        <w:t>2.2 Online PDF Reader Page (/:slug)</w:t>
-      </w:r>
-    </w:p>
-    <w:p>
-      <w:r>
-        <w:t>Renders the PDF inside the browser without forcing downloads. Features a matching navigation header with 'Kembali' (Back to Home) button, model title display, and a shortcut download button.</w:t>
-      </w:r>
-    </w:p>
-    <w:p>
-      <w:pPr>
-        <w:pStyle w:val="Heading2"/>
-        <w:spacing w:before="240" w:after="80"/>
-      </w:pPr>
-      <w:r>
-        <w:rPr>
-          <w:rFonts w:ascii="Outfit" w:hAnsi="Outfit"/>
-          <w:b/>
-          <w:color w:val="8F6F3F"/>
-          <w:sz w:val="26"/>
-        </w:rPr>
-        <w:t>2.3 Direct Auto-Downloader Page (/download/:slug)</w:t>
-      </w:r>
-    </w:p>
-    <w:p>
-      <w:r>
-        <w:t>A dedicated routing view that renders a 'Mengunduh Dokumen...' loader, waits 500ms for UI rendering, and triggers programmatic browser download of the PDF document.</w:t>
-      </w:r>
-    </w:p>
-    <w:p>
-      <w:pPr>
-        <w:pStyle w:val="Heading1"/>
-        <w:spacing w:before="360" w:after="120"/>
-      </w:pPr>
-      <w:r>
-        <w:rPr>
-          <w:rFonts w:ascii="Outfit" w:hAnsi="Outfit"/>
-          <w:b/>
-          <w:color w:val="442A07"/>
-          <w:sz w:val="32"/>
-        </w:rPr>
-        <w:t>3. Design System &amp; Brand Guidelines</w:t>
-      </w:r>
-    </w:p>
-    <w:p>
-      <w:pPr>
-        <w:spacing w:line="276" w:lineRule="auto"/>
-      </w:pPr>
-      <w:r>
-        <w:t>All UI elements use CSS custom tokens corresponding to the brand color tokens of the live Chronologie web application:</w:t>
-      </w:r>
-    </w:p>
-    <w:tbl>
-      <w:tblPr>
-        <w:tblW w:type="auto" w:w="0"/>
-        <w:jc w:val="center"/>
-        <w:tblLook w:firstColumn="1" w:firstRow="1" w:lastColumn="0" w:lastRow="0" w:noHBand="0" w:noVBand="1" w:val="04A0"/>
-      </w:tblPr>
-      <w:tblGrid>
-        <w:gridCol w:w="3120"/>
-        <w:gridCol w:w="3120"/>
-        <w:gridCol w:w="3120"/>
-      </w:tblGrid>
-      <w:tr>
-        <w:tc>
-          <w:tcPr>
-            <w:tcW w:type="dxa" w:w="3120"/>
-            <w:shd w:fill="442A07"/>
-          </w:tcPr>
-          <w:p>
-            <w:r>
-              <w:rPr>
-                <w:b/>
-                <w:color w:val="FFFFFF"/>
-              </w:rPr>
-              <w:t>Color Token</w:t>
-            </w:r>
-          </w:p>
-        </w:tc>
-        <w:tc>
-          <w:tcPr>
-            <w:tcW w:type="dxa" w:w="3120"/>
-            <w:shd w:fill="442A07"/>
-          </w:tcPr>
-          <w:p>
-            <w:r>
-              <w:rPr>
-                <w:b/>
-                <w:color w:val="FFFFFF"/>
-              </w:rPr>
-              <w:t>Hex Code</w:t>
-            </w:r>
-          </w:p>
-        </w:tc>
-        <w:tc>
-          <w:tcPr>
-            <w:tcW w:type="dxa" w:w="3120"/>
-            <w:shd w:fill="442A07"/>
-          </w:tcPr>
-          <w:p>
-            <w:r>
-              <w:rPr>
-                <w:b/>
-                <w:color w:val="FFFFFF"/>
-              </w:rPr>
-              <w:t>Description</w:t>
-            </w:r>
-          </w:p>
-        </w:tc>
-      </w:tr>
-      <w:tr>
-        <w:tc>
-          <w:tcPr>
-            <w:tcW w:type="dxa" w:w="3120"/>
-            <w:shd w:fill="FBF9F1"/>
-          </w:tcPr>
-          <w:p>
-            <w:r>
-              <w:t>--warm-gold</w:t>
-            </w:r>
-          </w:p>
-        </w:tc>
-        <w:tc>
-          <w:tcPr>
-            <w:tcW w:type="dxa" w:w="3120"/>
-            <w:shd w:fill="FBF9F1"/>
-          </w:tcPr>
-          <w:p>
-            <w:r>
-              <w:t>#e6d8a8</w:t>
-            </w:r>
-          </w:p>
-        </w:tc>
-        <w:tc>
-          <w:tcPr>
-            <w:tcW w:type="dxa" w:w="3120"/>
-            <w:shd w:fill="FBF9F1"/>
-          </w:tcPr>
-          <w:p>
-            <w:r>
-              <w:t>Accent gold/brass for header elements and bottom nav bar backgrounds.</w:t>
-            </w:r>
-          </w:p>
-        </w:tc>
-      </w:tr>
-      <w:tr>
-        <w:tc>
-          <w:tcPr>
-            <w:tcW w:type="dxa" w:w="3120"/>
-            <w:shd w:fill="FFFFFF"/>
-          </w:tcPr>
-          <w:p>
-            <w:r>
-              <w:t>--warm-brown</w:t>
-            </w:r>
-          </w:p>
-        </w:tc>
-        <w:tc>
-          <w:tcPr>
-            <w:tcW w:type="dxa" w:w="3120"/>
-            <w:shd w:fill="FFFFFF"/>
-          </w:tcPr>
-          <w:p>
-            <w:r>
-              <w:t>#442a07</w:t>
-            </w:r>
-          </w:p>
-        </w:tc>
-        <w:tc>
-          <w:tcPr>
-            <w:tcW w:type="dxa" w:w="3120"/>
-            <w:shd w:fill="FFFFFF"/>
-          </w:tcPr>
-          <w:p>
-            <w:r>
-              <w:t>Primary dark chocolate for text, active menu item accents, and main buttons.</w:t>
-            </w:r>
-          </w:p>
-        </w:tc>
-      </w:tr>
-      <w:tr>
-        <w:tc>
-          <w:tcPr>
-            <w:tcW w:type="dxa" w:w="3120"/>
-            <w:shd w:fill="FBF9F1"/>
-          </w:tcPr>
-          <w:p>
-            <w:r>
-              <w:t>--warm-tan</w:t>
-            </w:r>
-          </w:p>
-        </w:tc>
-        <w:tc>
-          <w:tcPr>
-            <w:tcW w:type="dxa" w:w="3120"/>
-            <w:shd w:fill="FBF9F1"/>
-          </w:tcPr>
-          <w:p>
-            <w:r>
-              <w:t>#8f6f3f</w:t>
-            </w:r>
-          </w:p>
-        </w:tc>
-        <w:tc>
-          <w:tcPr>
-            <w:tcW w:type="dxa" w:w="3120"/>
-            <w:shd w:fill="FBF9F1"/>
-          </w:tcPr>
-          <w:p>
-            <w:r>
-              <w:t>Accent brand tan for muted sub-texts and inactive state icons.</w:t>
-            </w:r>
-          </w:p>
-        </w:tc>
-      </w:tr>
-      <w:tr>
-        <w:tc>
-          <w:tcPr>
-            <w:tcW w:type="dxa" w:w="3120"/>
-            <w:shd w:fill="FFFFFF"/>
-          </w:tcPr>
-          <w:p>
-            <w:r>
-              <w:t>--warm-50</w:t>
-            </w:r>
-          </w:p>
-        </w:tc>
-        <w:tc>
-          <w:tcPr>
-            <w:tcW w:type="dxa" w:w="3120"/>
-            <w:shd w:fill="FFFFFF"/>
-          </w:tcPr>
-          <w:p>
-            <w:r>
-              <w:t>#fbf9f1</w:t>
-            </w:r>
-          </w:p>
-        </w:tc>
-        <w:tc>
-          <w:tcPr>
-            <w:tcW w:type="dxa" w:w="3120"/>
-            <w:shd w:fill="FFFFFF"/>
-          </w:tcPr>
-          <w:p>
-            <w:r>
-              <w:t>Warm cream off-white used for cards background and button texts.</w:t>
-            </w:r>
-          </w:p>
-        </w:tc>
-      </w:tr>
-      <w:tr>
-        <w:tc>
-          <w:tcPr>
-            <w:tcW w:type="dxa" w:w="3120"/>
-            <w:shd w:fill="FBF9F1"/>
-          </w:tcPr>
-          <w:p>
-            <w:r>
-              <w:t>--bg-light</w:t>
-            </w:r>
-          </w:p>
-        </w:tc>
-        <w:tc>
-          <w:tcPr>
-            <w:tcW w:type="dxa" w:w="3120"/>
-            <w:shd w:fill="FBF9F1"/>
-          </w:tcPr>
-          <w:p>
-            <w:r>
-              <w:t>#f8f6f2</w:t>
-            </w:r>
-          </w:p>
-        </w:tc>
-        <w:tc>
-          <w:tcPr>
-            <w:tcW w:type="dxa" w:w="3120"/>
-            <w:shd w:fill="FBF9F1"/>
-          </w:tcPr>
-          <w:p>
-            <w:r>
-              <w:t>Soft cream background representing the primary app background.</w:t>
-            </w:r>
-          </w:p>
-        </w:tc>
-      </w:tr>
-    </w:tbl>
-    <w:p>
-      <w:pPr>
-        <w:pStyle w:val="Heading1"/>
-        <w:spacing w:before="360" w:after="120"/>
-      </w:pPr>
-      <w:r>
-        <w:rPr>
-          <w:rFonts w:ascii="Outfit" w:hAnsi="Outfit"/>
-          <w:b/>
-          <w:color w:val="442A07"/>
-          <w:sz w:val="32"/>
-        </w:rPr>
-        <w:t>4. Technical Stack &amp; Architecture</w:t>
+        <w:t>Membangun Single Page Application (SPA) yang sangat cepat, handal diakses di mana saja, serta meminimalkan biaya server bulanan.</w:t>
       </w:r>
     </w:p>
     <w:p>
@@ -637,10 +295,33 @@
         <w:rPr>
           <w:b/>
         </w:rPr>
-        <w:t xml:space="preserve">Frontend Library: </w:t>
+        <w:t xml:space="preserve">Otomatisasi Alur Kerja (Workflows Automation): </w:t>
       </w:r>
       <w:r>
-        <w:t>React 19, TypeScript, and Vite 8 for fast hot module reloading and build compiles.</w:t>
+        <w:t>Membuat utilitas script backend otomatis untuk melakukan sinkronisasi file PDF, pembersihan judul otomatis, dan mencetak dua jenis QR Code (View QR dan Download QR) secara instan.</w:t>
+      </w:r>
+    </w:p>
+    <w:p>
+      <w:pPr>
+        <w:pStyle w:val="Heading1"/>
+        <w:spacing w:before="320" w:after="120"/>
+      </w:pPr>
+      <w:r>
+        <w:rPr>
+          <w:rFonts w:ascii="Outfit" w:hAnsi="Outfit"/>
+          <w:b/>
+          <w:color w:val="442A07"/>
+          <w:sz w:val="30"/>
+        </w:rPr>
+        <w:t>3. Key Performance Indicators / Metrik Keberhasilan</w:t>
+      </w:r>
+    </w:p>
+    <w:p>
+      <w:pPr>
+        <w:spacing w:after="120" w:line="276" w:lineRule="auto"/>
+      </w:pPr>
+      <w:r>
+        <w:t>Efektivitas dari portal baru ini diukur berdasarkan metrik-metrik keberhasilan berikut:</w:t>
       </w:r>
     </w:p>
     <w:p>
@@ -651,10 +332,10 @@
         <w:rPr>
           <w:b/>
         </w:rPr>
-        <w:t xml:space="preserve">Routing: </w:t>
+        <w:t xml:space="preserve">Kecepatan Akses (Load Time KPI): </w:t>
       </w:r>
       <w:r>
-        <w:t>react-router-dom for single-page routing without full page refreshes.</w:t>
+        <w:t>Waktu tunggu kustomer dari hasil pindai QR ke tampilan buku panduan di browser HP rata-rata di bawah 2 detik (2s).</w:t>
       </w:r>
     </w:p>
     <w:p>
@@ -665,10 +346,10 @@
         <w:rPr>
           <w:b/>
         </w:rPr>
-        <w:t xml:space="preserve">PDF Rendering: </w:t>
+        <w:t xml:space="preserve">Efisiensi Operasional (Time-to-Market KPI): </w:t>
       </w:r>
       <w:r>
-        <w:t>@react-pdf-viewer/core with pdfjs-dist via unpkg CDN (v3.11.174) for browser PDF parsing.</w:t>
+        <w:t>Waktu pemrosesan buku panduan baru (dari file mentah PDF menjadi QR Code siap cetak) berkurang drastis dari 2 hari kerja menjadi di bawah 5 menit.</w:t>
       </w:r>
     </w:p>
     <w:p>
@@ -679,25 +360,118 @@
         <w:rPr>
           <w:b/>
         </w:rPr>
-        <w:t xml:space="preserve">Animations: </w:t>
+        <w:t xml:space="preserve">Efisiensi Anggaran (Cost Savings KPI): </w:t>
       </w:r>
       <w:r>
-        <w:t>Framer Motion for iOS-like transitions and button physics.</w:t>
+        <w:t>Penghematan biaya hosting dan pemeliharaan server bulanan hingga mencapai 100% menggunakan arsitektur serverless (Vercel Free Tier).</w:t>
+      </w:r>
+    </w:p>
+    <w:p>
+      <w:pPr>
+        <w:pStyle w:val="ListBullet"/>
+      </w:pPr>
+      <w:r>
+        <w:rPr>
+          <w:b/>
+        </w:rPr>
+        <w:t xml:space="preserve">Ketersediaan Layanan (Uptime KPI): </w:t>
+      </w:r>
+      <w:r>
+        <w:t>Sistem harus tersedia secara global 24/7 dengan target uptime minimal 99.9% memanfaatkan jaringan CDN Vercel.</w:t>
       </w:r>
     </w:p>
     <w:p>
       <w:pPr>
         <w:pStyle w:val="Heading1"/>
-        <w:spacing w:before="360" w:after="120"/>
+        <w:spacing w:before="320" w:after="120"/>
       </w:pPr>
       <w:r>
         <w:rPr>
           <w:rFonts w:ascii="Outfit" w:hAnsi="Outfit"/>
           <w:b/>
           <w:color w:val="442A07"/>
-          <w:sz w:val="32"/>
+          <w:sz w:val="30"/>
         </w:rPr>
-        <w:t>5. Cost &amp; Development Benchmark (Outsource vs. Self Dev + AI)</w:t>
+        <w:t>4. Solusi Utama &amp; Fitur Yang Diterapkan</w:t>
+      </w:r>
+    </w:p>
+    <w:p>
+      <w:pPr>
+        <w:spacing w:line="276" w:lineRule="auto"/>
+      </w:pPr>
+      <w:r>
+        <w:t>Sistem V2 yang telah dibangun mencakup komponen-komponen solusi utama berikut:</w:t>
+      </w:r>
+    </w:p>
+    <w:p>
+      <w:pPr>
+        <w:pStyle w:val="ListBullet"/>
+      </w:pPr>
+      <w:r>
+        <w:rPr>
+          <w:b/>
+        </w:rPr>
+        <w:t xml:space="preserve">Desain Mobile App Modern: </w:t>
+      </w:r>
+      <w:r>
+        <w:t>Tampilan antarmuka bergaya aplikasi native seluler dengan header tetap, navigasi tab bawah (Beranda, Pindai QR, Bantuan), dan filter cepat brand berbentuk story lingkaran.</w:t>
+      </w:r>
+    </w:p>
+    <w:p>
+      <w:pPr>
+        <w:pStyle w:val="ListBullet"/>
+      </w:pPr>
+      <w:r>
+        <w:rPr>
+          <w:b/>
+        </w:rPr>
+        <w:t xml:space="preserve">Sistem Pembaca Online Cepat (View Mode): </w:t>
+      </w:r>
+      <w:r>
+        <w:t>Penyediaan pembaca PDF interaktif langsung di dalam aplikasi (menggunakan CDN stabil unpkg) sehingga kustomer tidak dipaksa mengunduh file secara otomatis saat ingin sekadar membaca cepat.</w:t>
+      </w:r>
+    </w:p>
+    <w:p>
+      <w:pPr>
+        <w:pStyle w:val="ListBullet"/>
+      </w:pPr>
+      <w:r>
+        <w:rPr>
+          <w:b/>
+        </w:rPr>
+        <w:t xml:space="preserve">Sistem Penyimpanan Cepat (Download Mode): </w:t>
+      </w:r>
+      <w:r>
+        <w:t>Halaman auto-download khusus untuk kustomer yang memindai QR Code versi unduh langsung.</w:t>
+      </w:r>
+    </w:p>
+    <w:p>
+      <w:pPr>
+        <w:pStyle w:val="ListBullet"/>
+      </w:pPr>
+      <w:r>
+        <w:rPr>
+          <w:b/>
+        </w:rPr>
+        <w:t xml:space="preserve">Generator QR &amp; Sinkronisasi Katalog: </w:t>
+      </w:r>
+      <w:r>
+        <w:t>Utilitas pemrosesan yang menyinkronkan file PDF lokal, membersihkan nama judul jam secara otomatis, dan mencetak QR Code mode baca (View) dan unduh (Download) dalam format PNG/SVG secara instan.</w:t>
+      </w:r>
+    </w:p>
+    <w:p>
+      <w:pPr>
+        <w:pStyle w:val="Heading1"/>
+        <w:spacing w:before="320" w:after="120"/>
+      </w:pPr>
+      <w:r>
+        <w:rPr>
+          <w:rFonts w:ascii="Outfit" w:hAnsi="Outfit"/>
+          <w:b/>
+          <w:color w:val="442A07"/>
+          <w:sz w:val="30"/>
+        </w:rPr>
+        <w:t>5. Analisis Kelayakan &amp; Efisiensi Anggaran (Outsource vs. Self Dev)</w:t>
       </w:r>
     </w:p>
     <w:p>
@@ -705,7 +479,7 @@
         <w:spacing w:line="276" w:lineRule="auto" w:after="200"/>
       </w:pPr>
       <w:r>
-        <w:t>Analisis perbandingan biaya dan efisiensi pengembangan sistem manual book antara menggunakan jasa pihak ketiga (Agency/Freelancer) dengan pengembangan mandiri dibantu AI (Self Development + Claude Pro &amp; Vercel Hosting):</w:t>
+        <w:t>Berikut adalah perbandingan nilai ekonomis antara menyerahkan pengerjaan ke pihak ketiga (Outsource) dengan melakukan pengembangan mandiri memanfaatkan AI (Self Development + Claude Pro &amp; Vercel):</w:t>
       </w:r>
     </w:p>
     <w:tbl>

</xml_diff>